<commit_message>
Initial project structure and requirements
</commit_message>
<xml_diff>
--- a/PYTHON.docx
+++ b/PYTHON.docx
@@ -603,6 +603,7 @@
       </w:pPr>
       <w:r>
         <w:rPr>
+          <w:noProof/>
           <w:lang w:val="en-US"/>
         </w:rPr>
         <w:lastRenderedPageBreak/>
@@ -708,6 +709,7 @@
       </w:pPr>
       <w:r>
         <w:rPr>
+          <w:noProof/>
           <w:lang w:val="en-US"/>
         </w:rPr>
         <w:drawing>
@@ -762,6 +764,7 @@
       </w:r>
       <w:r>
         <w:rPr>
+          <w:noProof/>
           <w:lang w:val="en-US"/>
         </w:rPr>
         <w:drawing>
@@ -808,6 +811,199 @@
           <w:lang w:val="en-US"/>
         </w:rPr>
       </w:pPr>
+      <w:r>
+        <w:rPr>
+          <w:lang w:val="en-US"/>
+        </w:rPr>
+        <w:t xml:space="preserve">This raises an error if you are using git for the first time because there are no common repository commits in vs code </w:t>
+      </w:r>
+    </w:p>
+    <w:p>
+      <w:pPr>
+        <w:jc w:val="center"/>
+        <w:rPr>
+          <w:lang w:val="en-US"/>
+        </w:rPr>
+      </w:pPr>
+      <w:r>
+        <w:rPr>
+          <w:lang w:val="en-US"/>
+        </w:rPr>
+        <w:t xml:space="preserve">So for the first time you have to type this command to set the vs code and git </w:t>
+      </w:r>
+      <w:r>
+        <w:rPr>
+          <w:lang w:val="en-US"/>
+        </w:rPr>
+        <w:drawing>
+          <wp:inline distT="0" distB="0" distL="0" distR="0" wp14:anchorId="32A6F5CA" wp14:editId="4758621F">
+            <wp:extent cx="5731510" cy="977900"/>
+            <wp:effectExtent l="0" t="0" r="2540" b="0"/>
+            <wp:docPr id="1840928294" name="Picture 1"/>
+            <wp:cNvGraphicFramePr>
+              <a:graphicFrameLocks xmlns:a="http://schemas.openxmlformats.org/drawingml/2006/main" noChangeAspect="1"/>
+            </wp:cNvGraphicFramePr>
+            <a:graphic xmlns:a="http://schemas.openxmlformats.org/drawingml/2006/main">
+              <a:graphicData uri="http://schemas.openxmlformats.org/drawingml/2006/picture">
+                <pic:pic xmlns:pic="http://schemas.openxmlformats.org/drawingml/2006/picture">
+                  <pic:nvPicPr>
+                    <pic:cNvPr id="1840928294" name=""/>
+                    <pic:cNvPicPr/>
+                  </pic:nvPicPr>
+                  <pic:blipFill>
+                    <a:blip r:embed="rId13"/>
+                    <a:stretch>
+                      <a:fillRect/>
+                    </a:stretch>
+                  </pic:blipFill>
+                  <pic:spPr>
+                    <a:xfrm>
+                      <a:off x="0" y="0"/>
+                      <a:ext cx="5731510" cy="977900"/>
+                    </a:xfrm>
+                    <a:prstGeom prst="rect">
+                      <a:avLst/>
+                    </a:prstGeom>
+                  </pic:spPr>
+                </pic:pic>
+              </a:graphicData>
+            </a:graphic>
+          </wp:inline>
+        </w:drawing>
+      </w:r>
+      <w:r>
+        <w:rPr>
+          <w:lang w:val="en-US"/>
+        </w:rPr>
+        <w:t>for understanding a snip from gpt</w:t>
+      </w:r>
+      <w:r>
+        <w:rPr>
+          <w:lang w:val="en-US"/>
+        </w:rPr>
+        <w:lastRenderedPageBreak/>
+        <w:drawing>
+          <wp:inline distT="0" distB="0" distL="0" distR="0" wp14:anchorId="14090137" wp14:editId="5CC3D06F">
+            <wp:extent cx="5731510" cy="2536190"/>
+            <wp:effectExtent l="0" t="0" r="2540" b="0"/>
+            <wp:docPr id="1178669512" name="Picture 1"/>
+            <wp:cNvGraphicFramePr>
+              <a:graphicFrameLocks xmlns:a="http://schemas.openxmlformats.org/drawingml/2006/main" noChangeAspect="1"/>
+            </wp:cNvGraphicFramePr>
+            <a:graphic xmlns:a="http://schemas.openxmlformats.org/drawingml/2006/main">
+              <a:graphicData uri="http://schemas.openxmlformats.org/drawingml/2006/picture">
+                <pic:pic xmlns:pic="http://schemas.openxmlformats.org/drawingml/2006/picture">
+                  <pic:nvPicPr>
+                    <pic:cNvPr id="1178669512" name=""/>
+                    <pic:cNvPicPr/>
+                  </pic:nvPicPr>
+                  <pic:blipFill>
+                    <a:blip r:embed="rId14"/>
+                    <a:stretch>
+                      <a:fillRect/>
+                    </a:stretch>
+                  </pic:blipFill>
+                  <pic:spPr>
+                    <a:xfrm>
+                      <a:off x="0" y="0"/>
+                      <a:ext cx="5731510" cy="2536190"/>
+                    </a:xfrm>
+                    <a:prstGeom prst="rect">
+                      <a:avLst/>
+                    </a:prstGeom>
+                  </pic:spPr>
+                </pic:pic>
+              </a:graphicData>
+            </a:graphic>
+          </wp:inline>
+        </w:drawing>
+      </w:r>
+      <w:r>
+        <w:rPr>
+          <w:lang w:val="en-US"/>
+        </w:rPr>
+        <w:drawing>
+          <wp:inline distT="0" distB="0" distL="0" distR="0" wp14:anchorId="5AD9C36E" wp14:editId="0D4503C7">
+            <wp:extent cx="5731510" cy="1218565"/>
+            <wp:effectExtent l="0" t="0" r="2540" b="635"/>
+            <wp:docPr id="1783910853" name="Picture 1"/>
+            <wp:cNvGraphicFramePr>
+              <a:graphicFrameLocks xmlns:a="http://schemas.openxmlformats.org/drawingml/2006/main" noChangeAspect="1"/>
+            </wp:cNvGraphicFramePr>
+            <a:graphic xmlns:a="http://schemas.openxmlformats.org/drawingml/2006/main">
+              <a:graphicData uri="http://schemas.openxmlformats.org/drawingml/2006/picture">
+                <pic:pic xmlns:pic="http://schemas.openxmlformats.org/drawingml/2006/picture">
+                  <pic:nvPicPr>
+                    <pic:cNvPr id="1783910853" name=""/>
+                    <pic:cNvPicPr/>
+                  </pic:nvPicPr>
+                  <pic:blipFill>
+                    <a:blip r:embed="rId15"/>
+                    <a:stretch>
+                      <a:fillRect/>
+                    </a:stretch>
+                  </pic:blipFill>
+                  <pic:spPr>
+                    <a:xfrm>
+                      <a:off x="0" y="0"/>
+                      <a:ext cx="5731510" cy="1218565"/>
+                    </a:xfrm>
+                    <a:prstGeom prst="rect">
+                      <a:avLst/>
+                    </a:prstGeom>
+                  </pic:spPr>
+                </pic:pic>
+              </a:graphicData>
+            </a:graphic>
+          </wp:inline>
+        </w:drawing>
+      </w:r>
+      <w:r>
+        <w:rPr>
+          <w:lang w:val="en-US"/>
+        </w:rPr>
+        <w:drawing>
+          <wp:inline distT="0" distB="0" distL="0" distR="0" wp14:anchorId="20F6B7E0" wp14:editId="33173982">
+            <wp:extent cx="5731510" cy="1877060"/>
+            <wp:effectExtent l="0" t="0" r="2540" b="8890"/>
+            <wp:docPr id="823737231" name="Picture 1"/>
+            <wp:cNvGraphicFramePr>
+              <a:graphicFrameLocks xmlns:a="http://schemas.openxmlformats.org/drawingml/2006/main" noChangeAspect="1"/>
+            </wp:cNvGraphicFramePr>
+            <a:graphic xmlns:a="http://schemas.openxmlformats.org/drawingml/2006/main">
+              <a:graphicData uri="http://schemas.openxmlformats.org/drawingml/2006/picture">
+                <pic:pic xmlns:pic="http://schemas.openxmlformats.org/drawingml/2006/picture">
+                  <pic:nvPicPr>
+                    <pic:cNvPr id="823737231" name=""/>
+                    <pic:cNvPicPr/>
+                  </pic:nvPicPr>
+                  <pic:blipFill>
+                    <a:blip r:embed="rId16"/>
+                    <a:stretch>
+                      <a:fillRect/>
+                    </a:stretch>
+                  </pic:blipFill>
+                  <pic:spPr>
+                    <a:xfrm>
+                      <a:off x="0" y="0"/>
+                      <a:ext cx="5731510" cy="1877060"/>
+                    </a:xfrm>
+                    <a:prstGeom prst="rect">
+                      <a:avLst/>
+                    </a:prstGeom>
+                  </pic:spPr>
+                </pic:pic>
+              </a:graphicData>
+            </a:graphic>
+          </wp:inline>
+        </w:drawing>
+      </w:r>
+      <w:r>
+        <w:rPr>
+          <w:lang w:val="en-US"/>
+        </w:rPr>
+        <w:t>then all the files are uploaded to git</w:t>
+      </w:r>
     </w:p>
     <w:p>
       <w:pPr>

</xml_diff>